<commit_message>
fix(imac): corrige la veille du 20/09 et durcit le prompt (étape 2 reconditionné, règles 9 bis, 10, 11) ; ㉚ présence n'est pas parole — une citation prêtée à quelqu'un via une page doit y être entre guillemets ; libellés de liens appariés ; B-NOM non bloquant sur page anglaise
Co-Authored-By: Claude Opus 5 <noreply@anthropic.com>
</commit_message>
<xml_diff>
--- a/sources/veille/imac/2026-09-20_veille_imac.docx
+++ b/sources/veille/imac/2026-09-20_veille_imac.docx
@@ -184,7 +184,20 @@
           <w:sz w:val="22"/>
           <w:szCs w:val="22"/>
         </w:rPr>
-        <w:t xml:space="preserve">Mac mini M6 disponible le 22/09/2026 (dans 2 jours) : 1 049 € en France — +50 % vs Mac mini M4 à 699 €. Premier produit M6 en vente ; puce 2 nm TSMC, 12c CPU / 12c GPU, double Neural Engine.</w:t>
+        <w:t xml:space="preserve">Mac mini M6 disponible le 22/09/2026 (dans 2 jours) : 1 049 € en France — +100 € sur le Mac mini M4 tel qu'il se vend depuis juin (949 €, consomac) ; +350 € (+50 %) seulement par rapport à son prix de lancement d'octobre 2024 (699 €). Premier produit M6 en vente ; 12c CPU / 12c GPU, double Neural Engine. </w:t>
+      </w:r>
+      <w:r>
+        <w:rPr>
+          <w:rFonts w:ascii="Calibri" w:cs="Calibri" w:eastAsia="Calibri" w:hAnsi="Calibri"/>
+          <w:b w:val="false"/>
+          <w:bCs w:val="false"/>
+          <w:i/>
+          <w:iCs/>
+          <w:color w:val="6B7280"/>
+          <w:sz w:val="20"/>
+          <w:szCs w:val="20"/>
+        </w:rPr>
+        <w:t xml:space="preserve">[Corrigé le 20/09/2026 : la note comparait au prix de lancement et taisait la hausse de juin ; « puce 2 nm TSMC » n'est sur aucune page consultée cette semaine, retiré.]</w:t>
       </w:r>
     </w:p>
     <w:p>
@@ -220,7 +233,7 @@
           <w:sz w:val="22"/>
           <w:szCs w:val="22"/>
         </w:rPr>
-        <w:t xml:space="preserve">Config entrée (8c/8c, 16 Go, 256 Go) : meilleur prix 1 689 € chez Fnac (−6 %). Le deal Joybuy à 1 499 € de la semaine dernière a disparu.</w:t>
+        <w:t xml:space="preserve">Config entrée (8c/8c, 16 Go, 256 Go) : meilleur prix neuf 1 689 € chez Fnac (−6 %) — et 1 519 € en reconditionné Apple (voir ci-dessous). Le deal Joybuy à 1 499 € de la semaine dernière a disparu.</w:t>
       </w:r>
     </w:p>
     <w:p>
@@ -256,7 +269,20 @@
           <w:sz w:val="22"/>
           <w:szCs w:val="22"/>
         </w:rPr>
-        <w:t xml:space="preserve">4 iMac M4 disponibles dont 2 à 1 689 € (10c/10c, 16 Go, 256 Go). Page lisible en headless cette semaine.</w:t>
+        <w:t xml:space="preserve">13 iMac M4 listés, dont 2 à 1 519 € (8c/8c, 16 Go, 256 Go — Vert, Orange) : c'est le meilleur prix de la semaine sur la configuration d'entrée, 170 € sous le meilleur neuf (Fnac) et 280 € sous l'Apple Store. Six 10c/10c à 1 689 €. Page lisible en headless cette semaine. </w:t>
+      </w:r>
+      <w:r>
+        <w:rPr>
+          <w:rFonts w:ascii="Calibri" w:cs="Calibri" w:eastAsia="Calibri" w:hAnsi="Calibri"/>
+          <w:b w:val="false"/>
+          <w:bCs w:val="false"/>
+          <w:i/>
+          <w:iCs/>
+          <w:color w:val="6B7280"/>
+          <w:sz w:val="20"/>
+          <w:szCs w:val="20"/>
+        </w:rPr>
+        <w:t xml:space="preserve">[Corrigé le 20/09/2026 : la note disait « 4 iMac M4 disponibles dont 2 à 1 689 € » — la page en porte treize, et le 1 519 € manquait.]</w:t>
       </w:r>
     </w:p>
     <w:p>
@@ -341,7 +367,20 @@
           <w:sz w:val="22"/>
           <w:szCs w:val="22"/>
         </w:rPr>
-        <w:t xml:space="preserve">Gurman (Bloomberg) dit "avant fin 2026" et "tout indique un lancement imminent". Consomac.fr (26/08) attribue à Gurman une sortie vers la fin du mois d'octobre — formulation non recoupée par les autres sources. MacRumors déduit octobre du calendrier habituel Apple. Aucune annonce officielle.</w:t>
+        <w:t xml:space="preserve">Gurman (Bloomberg) dit "before the end of the year" (cité entre guillemets par 9to5Mac, 23/08) ; "All signs point to the M6 models being close to launch" est cité par MacRumors (25/08) comme parole de Gurman, et repris sans guillemets, dans sa propre voix, par 9to5Mac. Consomac.fr (26/08) attribue à Gurman une sortie vers la fin du mois d'octobre — formulation non recoupée par les autres sources. MacRumors déduit octobre du calendrier habituel Apple. Aucune annonce officielle. </w:t>
+      </w:r>
+      <w:r>
+        <w:rPr>
+          <w:rFonts w:ascii="Calibri" w:cs="Calibri" w:eastAsia="Calibri" w:hAnsi="Calibri"/>
+          <w:b w:val="false"/>
+          <w:bCs w:val="false"/>
+          <w:i/>
+          <w:iCs/>
+          <w:color w:val="6B7280"/>
+          <w:sz w:val="20"/>
+          <w:szCs w:val="20"/>
+        </w:rPr>
+        <w:t xml:space="preserve">[Corrigé le 20/09/2026 : « tout indique un lancement imminent » était présenté comme une parole de Gurman ; c'est une phrase de 9to5Mac.]</w:t>
       </w:r>
     </w:p>
     <w:p>
@@ -1122,7 +1161,7 @@
                 <w:sz w:val="22"/>
                 <w:szCs w:val="22"/>
               </w:rPr>
-              <w:t xml:space="preserve">M4 · 10c/10c · 16 Go · 256 Go</w:t>
+              <w:t xml:space="preserve">M4 · 8c/8c · 16 Go · 256 Go</w:t>
             </w:r>
           </w:p>
         </w:tc>
@@ -1143,28 +1182,28 @@
                 <w:sz w:val="22"/>
                 <w:szCs w:val="22"/>
               </w:rPr>
-              <w:t xml:space="preserve">1 689 €</w:t>
-            </w:r>
-          </w:p>
-        </w:tc>
-        <w:tc>
-          <w:p>
-            <w:pPr>
-              <w:spacing w:after="40" w:before="40"/>
-              <w:jc w:val="left"/>
-            </w:pPr>
-            <w:r>
-              <w:rPr>
-                <w:rFonts w:ascii="Calibri" w:cs="Calibri" w:eastAsia="Calibri" w:hAnsi="Calibri"/>
-                <w:b w:val="false"/>
-                <w:bCs w:val="false"/>
-                <w:i w:val="false"/>
-                <w:iCs w:val="false"/>
-                <w:color w:val="1F2937"/>
-                <w:sz w:val="22"/>
-                <w:szCs w:val="22"/>
-              </w:rPr>
-              <w:t xml:space="preserve">Vert</w:t>
+              <w:t xml:space="preserve">1 519 €</w:t>
+            </w:r>
+          </w:p>
+        </w:tc>
+        <w:tc>
+          <w:p>
+            <w:pPr>
+              <w:spacing w:after="40" w:before="40"/>
+              <w:jc w:val="left"/>
+            </w:pPr>
+            <w:r>
+              <w:rPr>
+                <w:rFonts w:ascii="Calibri" w:cs="Calibri" w:eastAsia="Calibri" w:hAnsi="Calibri"/>
+                <w:b w:val="false"/>
+                <w:bCs w:val="false"/>
+                <w:i w:val="false"/>
+                <w:iCs w:val="false"/>
+                <w:color w:val="1F2937"/>
+                <w:sz w:val="22"/>
+                <w:szCs w:val="22"/>
+              </w:rPr>
+              <w:t xml:space="preserve">Vert · Orange (2)</w:t>
             </w:r>
           </w:p>
         </w:tc>
@@ -1174,33 +1213,27 @@
           <w:tblHeader w:val="false"/>
         </w:trPr>
         <w:tc>
-          <w:tcPr>
-            <w:shd w:fill="F9FAFB" w:color="auto" w:val="clear"/>
-          </w:tcPr>
-          <w:p>
-            <w:pPr>
-              <w:spacing w:after="40" w:before="40"/>
-              <w:jc w:val="left"/>
-            </w:pPr>
-            <w:r>
-              <w:rPr>
-                <w:rFonts w:ascii="Calibri" w:cs="Calibri" w:eastAsia="Calibri" w:hAnsi="Calibri"/>
-                <w:b w:val="false"/>
-                <w:bCs w:val="false"/>
-                <w:i w:val="false"/>
-                <w:iCs w:val="false"/>
-                <w:color w:val="1F2937"/>
-                <w:sz w:val="22"/>
-                <w:szCs w:val="22"/>
-              </w:rPr>
-              <w:t xml:space="preserve">M4 · 10c/10c · 16 Go · 256 Go</w:t>
-            </w:r>
-          </w:p>
-        </w:tc>
-        <w:tc>
-          <w:tcPr>
-            <w:shd w:fill="F9FAFB" w:color="auto" w:val="clear"/>
-          </w:tcPr>
+          <w:p>
+            <w:pPr>
+              <w:spacing w:after="40" w:before="40"/>
+              <w:jc w:val="left"/>
+            </w:pPr>
+            <w:r>
+              <w:rPr>
+                <w:rFonts w:ascii="Calibri" w:cs="Calibri" w:eastAsia="Calibri" w:hAnsi="Calibri"/>
+                <w:b w:val="false"/>
+                <w:bCs w:val="false"/>
+                <w:i w:val="false"/>
+                <w:iCs w:val="false"/>
+                <w:color w:val="1F2937"/>
+                <w:sz w:val="22"/>
+                <w:szCs w:val="22"/>
+              </w:rPr>
+              <w:t xml:space="preserve">M4 · 10c/10c · 16 Go · 256 Go · Gigabit Ethernet</w:t>
+            </w:r>
+          </w:p>
+        </w:tc>
+        <w:tc>
           <w:p>
             <w:pPr>
               <w:spacing w:after="40" w:before="40"/>
@@ -1222,26 +1255,23 @@
           </w:p>
         </w:tc>
         <w:tc>
-          <w:tcPr>
-            <w:shd w:fill="F9FAFB" w:color="auto" w:val="clear"/>
-          </w:tcPr>
-          <w:p>
-            <w:pPr>
-              <w:spacing w:after="40" w:before="40"/>
-              <w:jc w:val="left"/>
-            </w:pPr>
-            <w:r>
-              <w:rPr>
-                <w:rFonts w:ascii="Calibri" w:cs="Calibri" w:eastAsia="Calibri" w:hAnsi="Calibri"/>
-                <w:b w:val="false"/>
-                <w:bCs w:val="false"/>
-                <w:i w:val="false"/>
-                <w:iCs w:val="false"/>
-                <w:color w:val="1F2937"/>
-                <w:sz w:val="22"/>
-                <w:szCs w:val="22"/>
-              </w:rPr>
-              <w:t xml:space="preserve">Bleu</w:t>
+          <w:p>
+            <w:pPr>
+              <w:spacing w:after="40" w:before="40"/>
+              <w:jc w:val="left"/>
+            </w:pPr>
+            <w:r>
+              <w:rPr>
+                <w:rFonts w:ascii="Calibri" w:cs="Calibri" w:eastAsia="Calibri" w:hAnsi="Calibri"/>
+                <w:b w:val="false"/>
+                <w:bCs w:val="false"/>
+                <w:i w:val="false"/>
+                <w:iCs w:val="false"/>
+                <w:color w:val="1F2937"/>
+                <w:sz w:val="22"/>
+                <w:szCs w:val="22"/>
+              </w:rPr>
+              <w:t xml:space="preserve">Argent · Jaune · Vert · Bleu · Rose · Orange (6)</w:t>
             </w:r>
           </w:p>
         </w:tc>
@@ -1267,21 +1297,21 @@
                 <w:sz w:val="22"/>
                 <w:szCs w:val="22"/>
               </w:rPr>
-              <w:t xml:space="preserve">M4 · 10c/10c · 16 Go · 256 Go</w:t>
-            </w:r>
-          </w:p>
-        </w:tc>
-        <w:tc>
-          <w:p>
-            <w:pPr>
-              <w:spacing w:after="40" w:before="40"/>
-              <w:jc w:val="left"/>
-            </w:pPr>
-            <w:r>
-              <w:rPr>
-                <w:rFonts w:ascii="Calibri" w:cs="Calibri" w:eastAsia="Calibri" w:hAnsi="Calibri"/>
-                <w:b w:val="false"/>
-                <w:bCs w:val="false"/>
+              <w:t xml:space="preserve">M4 · 10c/10c · Gigabit · écran nano-texturé</w:t>
+            </w:r>
+          </w:p>
+        </w:tc>
+        <w:tc>
+          <w:p>
+            <w:pPr>
+              <w:spacing w:after="40" w:before="40"/>
+              <w:jc w:val="left"/>
+            </w:pPr>
+            <w:r>
+              <w:rPr>
+                <w:rFonts w:ascii="Calibri" w:cs="Calibri" w:eastAsia="Calibri" w:hAnsi="Calibri"/>
+                <w:b/>
+                <w:bCs/>
                 <w:i w:val="false"/>
                 <w:iCs w:val="false"/>
                 <w:color w:val="1F2937"/>
@@ -1309,7 +1339,7 @@
                 <w:sz w:val="22"/>
                 <w:szCs w:val="22"/>
               </w:rPr>
-              <w:t xml:space="preserve">Argent</w:t>
+              <w:t xml:space="preserve">Argent · Jaune · Bleu (3)</w:t>
             </w:r>
           </w:p>
         </w:tc>
@@ -1319,43 +1349,105 @@
           <w:tblHeader w:val="false"/>
         </w:trPr>
         <w:tc>
-          <w:tcPr>
-            <w:shd w:fill="F9FAFB" w:color="auto" w:val="clear"/>
-          </w:tcPr>
-          <w:p>
-            <w:pPr>
-              <w:spacing w:after="40" w:before="40"/>
-              <w:jc w:val="left"/>
-            </w:pPr>
-            <w:r>
-              <w:rPr>
-                <w:rFonts w:ascii="Calibri" w:cs="Calibri" w:eastAsia="Calibri" w:hAnsi="Calibri"/>
-                <w:b w:val="false"/>
-                <w:bCs w:val="false"/>
-                <w:i w:val="false"/>
-                <w:iCs w:val="false"/>
-                <w:color w:val="1F2937"/>
-                <w:sz w:val="22"/>
-                <w:szCs w:val="22"/>
-              </w:rPr>
-              <w:t xml:space="preserve">M4 · 10c/10c · 32 Go · 1 To</w:t>
-            </w:r>
-          </w:p>
-        </w:tc>
-        <w:tc>
-          <w:tcPr>
-            <w:shd w:fill="F9FAFB" w:color="auto" w:val="clear"/>
-          </w:tcPr>
-          <w:p>
-            <w:pPr>
-              <w:spacing w:after="40" w:before="40"/>
-              <w:jc w:val="left"/>
-            </w:pPr>
-            <w:r>
-              <w:rPr>
-                <w:rFonts w:ascii="Calibri" w:cs="Calibri" w:eastAsia="Calibri" w:hAnsi="Calibri"/>
-                <w:b w:val="false"/>
-                <w:bCs w:val="false"/>
+          <w:p>
+            <w:pPr>
+              <w:spacing w:after="40" w:before="40"/>
+              <w:jc w:val="left"/>
+            </w:pPr>
+            <w:r>
+              <w:rPr>
+                <w:rFonts w:ascii="Calibri" w:cs="Calibri" w:eastAsia="Calibri" w:hAnsi="Calibri"/>
+                <w:b w:val="false"/>
+                <w:bCs w:val="false"/>
+                <w:i w:val="false"/>
+                <w:iCs w:val="false"/>
+                <w:color w:val="1F2937"/>
+                <w:sz w:val="22"/>
+                <w:szCs w:val="22"/>
+              </w:rPr>
+              <w:t xml:space="preserve">M4 · 10c/10c · nano-texturé (mémoire / SSD non lisibles dans le texte de la page)</w:t>
+            </w:r>
+          </w:p>
+        </w:tc>
+        <w:tc>
+          <w:p>
+            <w:pPr>
+              <w:spacing w:after="40" w:before="40"/>
+              <w:jc w:val="left"/>
+            </w:pPr>
+            <w:r>
+              <w:rPr>
+                <w:rFonts w:ascii="Calibri" w:cs="Calibri" w:eastAsia="Calibri" w:hAnsi="Calibri"/>
+                <w:b/>
+                <w:bCs/>
+                <w:i w:val="false"/>
+                <w:iCs w:val="false"/>
+                <w:color w:val="1F2937"/>
+                <w:sz w:val="22"/>
+                <w:szCs w:val="22"/>
+              </w:rPr>
+              <w:t xml:space="preserve">2 539 €</w:t>
+            </w:r>
+          </w:p>
+        </w:tc>
+        <w:tc>
+          <w:p>
+            <w:pPr>
+              <w:spacing w:after="40" w:before="40"/>
+              <w:jc w:val="left"/>
+            </w:pPr>
+            <w:r>
+              <w:rPr>
+                <w:rFonts w:ascii="Calibri" w:cs="Calibri" w:eastAsia="Calibri" w:hAnsi="Calibri"/>
+                <w:b w:val="false"/>
+                <w:bCs w:val="false"/>
+                <w:i w:val="false"/>
+                <w:iCs w:val="false"/>
+                <w:color w:val="1F2937"/>
+                <w:sz w:val="22"/>
+                <w:szCs w:val="22"/>
+              </w:rPr>
+              <w:t xml:space="preserve">Rose (1)</w:t>
+            </w:r>
+          </w:p>
+        </w:tc>
+      </w:tr>
+      <w:tr>
+        <w:trPr>
+          <w:tblHeader w:val="false"/>
+        </w:trPr>
+        <w:tc>
+          <w:p>
+            <w:pPr>
+              <w:spacing w:after="40" w:before="40"/>
+              <w:jc w:val="left"/>
+            </w:pPr>
+            <w:r>
+              <w:rPr>
+                <w:rFonts w:ascii="Calibri" w:cs="Calibri" w:eastAsia="Calibri" w:hAnsi="Calibri"/>
+                <w:b w:val="false"/>
+                <w:bCs w:val="false"/>
+                <w:i w:val="false"/>
+                <w:iCs w:val="false"/>
+                <w:color w:val="1F2937"/>
+                <w:sz w:val="22"/>
+                <w:szCs w:val="22"/>
+              </w:rPr>
+              <w:t xml:space="preserve">M4 · 10c/10c · nano-texturé (mémoire / SSD non lisibles dans le texte de la page)</w:t>
+            </w:r>
+          </w:p>
+        </w:tc>
+        <w:tc>
+          <w:p>
+            <w:pPr>
+              <w:spacing w:after="40" w:before="40"/>
+              <w:jc w:val="left"/>
+            </w:pPr>
+            <w:r>
+              <w:rPr>
+                <w:rFonts w:ascii="Calibri" w:cs="Calibri" w:eastAsia="Calibri" w:hAnsi="Calibri"/>
+                <w:b/>
+                <w:bCs/>
                 <w:i w:val="false"/>
                 <w:iCs w:val="false"/>
                 <w:color w:val="1F2937"/>
@@ -1367,26 +1459,23 @@
           </w:p>
         </w:tc>
         <w:tc>
-          <w:tcPr>
-            <w:shd w:fill="F9FAFB" w:color="auto" w:val="clear"/>
-          </w:tcPr>
-          <w:p>
-            <w:pPr>
-              <w:spacing w:after="40" w:before="40"/>
-              <w:jc w:val="left"/>
-            </w:pPr>
-            <w:r>
-              <w:rPr>
-                <w:rFonts w:ascii="Calibri" w:cs="Calibri" w:eastAsia="Calibri" w:hAnsi="Calibri"/>
-                <w:b w:val="false"/>
-                <w:bCs w:val="false"/>
-                <w:i w:val="false"/>
-                <w:iCs w:val="false"/>
-                <w:color w:val="1F2937"/>
-                <w:sz w:val="22"/>
-                <w:szCs w:val="22"/>
-              </w:rPr>
-              <w:t xml:space="preserve">Rose</w:t>
+          <w:p>
+            <w:pPr>
+              <w:spacing w:after="40" w:before="40"/>
+              <w:jc w:val="left"/>
+            </w:pPr>
+            <w:r>
+              <w:rPr>
+                <w:rFonts w:ascii="Calibri" w:cs="Calibri" w:eastAsia="Calibri" w:hAnsi="Calibri"/>
+                <w:b w:val="false"/>
+                <w:bCs w:val="false"/>
+                <w:i w:val="false"/>
+                <w:iCs w:val="false"/>
+                <w:color w:val="1F2937"/>
+                <w:sz w:val="22"/>
+                <w:szCs w:val="22"/>
+              </w:rPr>
+              <w:t xml:space="preserve">Rose (1)</w:t>
             </w:r>
           </w:p>
         </w:tc>
@@ -1405,10 +1494,23 @@
           <w:i/>
           <w:iCs/>
           <w:color w:val="6B7280"/>
-          <w:sz w:val="22"/>
-          <w:szCs w:val="22"/>
-        </w:rPr>
-        <w:t xml:space="preserve">4 iMac M4 reconditionnés disponibles (page lisible en headless cette semaine ; la semaine précédente, la page était non lue). Le modèle 10c/10c 16 Go/256 Go Vert à 1 689 € correspond au même prix que le meilleur neuf chez Fnac — aucun gain financier sur cette config, mais stock certifié Apple et livraison immédiate.</w:t>
+          <w:sz w:val="20"/>
+          <w:szCs w:val="20"/>
+        </w:rPr>
+        <w:t xml:space="preserve">13 iMac M4 reconditionnés listés sur la page le 20/09/2026 (compte et paliers relus ligne à ligne). Le 8c/8c à 1 519 € — « Ancien prix : 1 799,00 € Économisez 280,00 € » — est le meilleur prix de la semaine sur la configuration d'entrée suivie, 170 € sous le meilleur neuf (Fnac 1 689 €). Le 10c/10c à 1 689 € (« Économisez 310,00 € ») se compare à son homologue neuf, 1 899 € (Amazon / Cdiscount) ou 1 999 € (Apple) : 210 à 310 € d'écart. Stock certifié Apple, livraison immédiate. </w:t>
+      </w:r>
+      <w:r>
+        <w:rPr>
+          <w:rFonts w:ascii="Calibri" w:cs="Calibri" w:eastAsia="Calibri" w:hAnsi="Calibri"/>
+          <w:b w:val="false"/>
+          <w:bCs w:val="false"/>
+          <w:i/>
+          <w:iCs/>
+          <w:color w:val="6B7280"/>
+          <w:sz w:val="20"/>
+          <w:szCs w:val="20"/>
+        </w:rPr>
+        <w:t xml:space="preserve">[Corrigé le 20/09/2026 : la note comptait 4 lignes sur 13, omettait le 1 519 €, et comparait le 10c/10c reconditionné (1 689 €) au 8c/8c neuf (1 689 € Fnac) pour conclure « aucun gain financier ».]</w:t>
       </w:r>
     </w:p>
     <w:p>
@@ -2351,7 +2453,7 @@
                 <w:szCs w:val="22"/>
               </w:rPr>
               <w:t xml:space="preserve">macOS — mises à jour gratuites
-8+ ans de support logiciel typique
+Durée de support logiciel : non sourcée ici
 Ecosystème Apple (iPhone, iPad…)</w:t>
             </w:r>
           </w:p>
@@ -2456,8 +2558,8 @@
                 <w:sz w:val="22"/>
                 <w:szCs w:val="22"/>
               </w:rPr>
-              <w:t xml:space="preserve">RAM DDR5 extensible jusqu'à 64 Go
-SSD M.2 remplaçable (selon modèle)</w:t>
+              <w:t xml:space="preserve">RAM SO-DIMM DDR5, 2 slots (1 × 32 Go installé — fiche LDLC)
+SSD M.2 PCIe (remplaçable, non garanti par la fiche)</w:t>
             </w:r>
           </w:p>
         </w:tc>
@@ -2847,20 +2949,20 @@
           <w:sz w:val="22"/>
           <w:szCs w:val="22"/>
         </w:rPr>
-        <w:t xml:space="preserve">Apple Reconditionné — iMac M4 10c/10c · 16 Go · 256 Go : </w:t>
-      </w:r>
-      <w:r>
-        <w:rPr>
-          <w:rFonts w:ascii="Calibri" w:cs="Calibri" w:eastAsia="Calibri" w:hAnsi="Calibri"/>
-          <w:b w:val="false"/>
-          <w:bCs w:val="false"/>
-          <w:i w:val="false"/>
-          <w:iCs w:val="false"/>
-          <w:color w:val="1F2937"/>
-          <w:sz w:val="22"/>
-          <w:szCs w:val="22"/>
-        </w:rPr>
-        <w:t xml:space="preserve">1 689 € (Vert ou Bleu) — même prix que le meilleur marché neuf. Avantage : stock disponible et livraison rapide, certification Apple.</w:t>
+        <w:t xml:space="preserve">Apple Reconditionné — iMac M4 8c/8c · 16 Go · 256 Go : 1 519 € (Vert, Orange) — meilleur prix de la semaine sur la config d'entrée, −170 € vs Fnac. Et 10c/10c · 16 Go · 256 Go : </w:t>
+      </w:r>
+      <w:r>
+        <w:rPr>
+          <w:rFonts w:ascii="Calibri" w:cs="Calibri" w:eastAsia="Calibri" w:hAnsi="Calibri"/>
+          <w:b w:val="false"/>
+          <w:bCs w:val="false"/>
+          <w:i w:val="false"/>
+          <w:iCs w:val="false"/>
+          <w:color w:val="1F2937"/>
+          <w:sz w:val="22"/>
+          <w:szCs w:val="22"/>
+        </w:rPr>
+        <w:t xml:space="preserve">1 689 € (six coloris) — 210 € sous son homologue neuf (Amazon / Cdiscount 1 899 €). Avantage : stock disponible et livraison rapide, certification Apple.</w:t>
       </w:r>
       <w:r>
         <w:rPr>
@@ -2887,6 +2989,19 @@
           <w:t xml:space="preserve">apple.com/fr/shop/refurbished/mac</w:t>
         </w:r>
       </w:hyperlink>
+      <w:r>
+        <w:rPr>
+          <w:rFonts w:ascii="Calibri" w:cs="Calibri" w:eastAsia="Calibri" w:hAnsi="Calibri"/>
+          <w:b w:val="false"/>
+          <w:bCs w:val="false"/>
+          <w:i/>
+          <w:iCs/>
+          <w:color w:val="6B7280"/>
+          <w:sz w:val="20"/>
+          <w:szCs w:val="20"/>
+        </w:rPr>
+        <w:t xml:space="preserve"> [Corrigé le 20/09/2026 : le 1 519 € manquait et la comparaison portait sur deux configurations différentes.]</w:t>
+      </w:r>
     </w:p>
     <w:p>
       <w:pPr>
@@ -3114,7 +3229,20 @@
           <w:sz w:val="22"/>
           <w:szCs w:val="22"/>
         </w:rPr>
-        <w:t xml:space="preserve"> : "before the end of the year" et "All signs point to the M6 models being close to launch".</w:t>
+        <w:t xml:space="preserve"> : "before the end of the year" (entre guillemets sur la page). La phrase "All signs point to the M6 models being close to launch" y figure aussi, mais dans la voix de 9to5Mac, sans guillemets — c'est MacRumors (25/08/2026) qui la cite entre guillemets en la prêtant à Gurman (« says Gurman »). </w:t>
+      </w:r>
+      <w:r>
+        <w:rPr>
+          <w:rFonts w:ascii="Calibri" w:cs="Calibri" w:eastAsia="Calibri" w:hAnsi="Calibri"/>
+          <w:b w:val="false"/>
+          <w:bCs w:val="false"/>
+          <w:i/>
+          <w:iCs/>
+          <w:color w:val="6B7280"/>
+          <w:sz w:val="20"/>
+          <w:szCs w:val="20"/>
+        </w:rPr>
+        <w:t xml:space="preserve">[Corrigé le 20/09/2026 : les deux phrases étaient données comme des paroles de Gurman citées par 9to5Mac ; la correction du 13/09 avait déjà rendu la seconde à MacRumors.]</w:t>
       </w:r>
     </w:p>
     <w:p>
@@ -3255,7 +3383,7 @@
           <w:sz w:val="22"/>
           <w:szCs w:val="22"/>
         </w:rPr>
-        <w:t xml:space="preserve">Gurman dit "avant fin 2026" et "tout indique un lancement imminent". Consomac.fr (26/08) attribue à Gurman une sortie vers fin octobre — non recoupée. MacRumors déduit octobre du calendrier habituel Apple. Apple n'a rien annoncé. À retenir : avant fin 2026 (Gurman), avec octobre comme estimation la plus citée mais non confirmée.</w:t>
+        <w:t xml:space="preserve">Gurman dit "avant fin 2026" (9to5Mac) ; "tout indique un lancement imminent" est une phrase de 9to5Mac, que MacRumors prête à Gurman. Consomac.fr (26/08) attribue à Gurman une sortie vers fin octobre — non recoupée. MacRumors déduit octobre du calendrier habituel Apple. Apple n'a rien annoncé. À retenir : avant fin 2026 (Gurman), avec octobre comme estimation la plus citée mais non confirmée.</w:t>
       </w:r>
     </w:p>
     <w:p>
@@ -3297,7 +3425,20 @@
           <w:sz w:val="22"/>
           <w:szCs w:val="22"/>
         </w:rPr>
-        <w:t xml:space="preserve">Procédé : 2 nm TSMC (première puce Apple Silicon à ce procédé — le M4 iMac actuel est en 3 nm)</w:t>
+        <w:t xml:space="preserve">Procédé de gravure : non indiqué sur les trois pages consultées cette semaine (macg.co, consomac 24448, consomac 26/08) — non repris. </w:t>
+      </w:r>
+      <w:r>
+        <w:rPr>
+          <w:rFonts w:ascii="Calibri" w:cs="Calibri" w:eastAsia="Calibri" w:hAnsi="Calibri"/>
+          <w:b w:val="false"/>
+          <w:bCs w:val="false"/>
+          <w:i/>
+          <w:iCs/>
+          <w:color w:val="6B7280"/>
+          <w:sz w:val="20"/>
+          <w:szCs w:val="20"/>
+        </w:rPr>
+        <w:t xml:space="preserve">[Corrigé le 20/09/2026 : « 2 nm TSMC (première puce Apple Silicon à ce procédé — le M4 est en 3 nm) » venait de GeeksLands, citée le 13/09 et non rouverte.]</w:t>
       </w:r>
     </w:p>
     <w:p>
@@ -3423,7 +3564,7 @@
           <w:sz w:val="22"/>
           <w:szCs w:val="22"/>
         </w:rPr>
-        <w:t xml:space="preserve">Mac mini M6 disponible le 22/09/2026 (dans 2 jours). Prix France : 1 049 € (16 Go/256 Go) vs Mac mini M4 à 699 € au lancement — +350 € soit +50 %. Source : </w:t>
+        <w:t xml:space="preserve">Mac mini M6 disponible le 22/09/2026 (dans 2 jours). Prix France : 1 049 € (16 Go/256 Go) — +100 € sur le Mac mini M4 au tarif courant : consomac.fr (news 24448) écrit « le modèle de base avec 256 Go était alors passé de 699 € à 949 € … une nouvelle hausse de 100 € ». Par rapport au prix de lancement d'octobre 2024 (699 €), c'est +350 € (+50 %) — une comparaison que macg.co invite lui-même à nuancer. Source : </w:t>
       </w:r>
       <w:hyperlink w:history="1" r:id="rIdpvxiqylza0jlf8axflpin">
         <w:r>
@@ -3505,7 +3646,7 @@
           <w:sz w:val="22"/>
           <w:szCs w:val="22"/>
         </w:rPr>
-        <w:t xml:space="preserve">: si le précédent Mac mini sert d'indicateur (+50 %), l'iMac M6 pourrait démarrer significativement plus haut que le M4. Conséquence : </w:t>
+        <w:t xml:space="preserve">: le précédent Mac mini, au tarif courant, c'est +100 € — et l'iMac M4 a déjà encaissé sa hausse de juin (1 499 → 1 799 €, consomac bons plans). Une hausse à l'annonce M6 reste possible, de l'ordre de la centaine d'euros plutôt que de plusieurs centaines. Conséquence : </w:t>
       </w:r>
       <w:r>
         <w:rPr>
@@ -3558,6 +3699,19 @@
           <w:szCs w:val="22"/>
         </w:rPr>
         <w:t xml:space="preserve"> l'iMac M6 neuf risque d'être sensiblement plus cher que le M4 actuel.</w:t>
+      </w:r>
+      <w:r>
+        <w:rPr>
+          <w:rFonts w:ascii="Calibri" w:cs="Calibri" w:eastAsia="Calibri" w:hAnsi="Calibri"/>
+          <w:b w:val="false"/>
+          <w:bCs w:val="false"/>
+          <w:i/>
+          <w:iCs/>
+          <w:color w:val="6B7280"/>
+          <w:sz w:val="20"/>
+          <w:szCs w:val="20"/>
+        </w:rPr>
+        <w:t xml:space="preserve"> [Corrigé le 20/09/2026 : le « +50 % » de lancement comptait deux fois la hausse de juin.]</w:t>
       </w:r>
     </w:p>
     <w:p>
@@ -3754,7 +3908,7 @@
                 <w:szCs w:val="22"/>
               </w:rPr>
               <w:t xml:space="preserve">• iMac M6 attendu dans quelques semaines → dépréciation du M4 à l'annonce
-• Puce M6 2 nm : performances significativement supérieures (CPU +40 %+ vs M4)
+• Puce M6 : CPU annoncé +44 % vs l'iMac M4 actuel (consomac, 26/08)
 • Prix M4 d'occasion va baisser post-annonce M6</w:t>
             </w:r>
           </w:p>
@@ -3810,7 +3964,7 @@
                 <w:sz w:val="22"/>
                 <w:szCs w:val="22"/>
               </w:rPr>
-              <w:t xml:space="preserve">• Puce la plus récente (2 nm, 12c CPU, double Neural Engine)
+              <w:t xml:space="preserve">• Puce la plus récente (12c CPU, double Neural Engine)
 • Nouvelles couleurs
 • Potentielle baisse des prix M4 dès l'annonce
 • Mac mini M6 donne une base de perf réelle</w:t>
@@ -3839,7 +3993,7 @@
                 <w:szCs w:val="22"/>
               </w:rPr>
               <w:t xml:space="preserve">• Date non confirmée (octobre le plus cité, mais pas garanti)
-• Prix attendu en hausse : le Mac mini M6 a pris +50 % vs M4 — risque réel que l'iMac M6 dépasse l'iMac M4 actuel de plusieurs centaines d'euros
+• Prix attendu en hausse : le Mac mini M6 coûte +100 € de plus que le M4 au tarif courant (la hausse de juin est déjà dans le prix de l'iMac M4) — une hausse à l'annonce reste possible
 • Design et taille d'écran identiques au M4</w:t>
             </w:r>
           </w:p>
@@ -3894,7 +4048,7 @@
                 <w:szCs w:val="22"/>
               </w:rPr>
               <w:t xml:space="preserve">• HP OmniStudio 27" en promo à 1 599,95 € (jusqu'au 21/09 seulement)
-• RAM extensible jusqu'à 64 Go · SSD remplaçable
+• 2 slots SO-DIMM DDR5 (fiche LDLC) · SSD M.2
 • Garantie 5 ans LDLC
 • Compatibilité logicielle Windows plus large</w:t>
             </w:r>
@@ -4043,7 +4197,7 @@
           <w:sz w:val="22"/>
           <w:szCs w:val="22"/>
         </w:rPr>
-        <w:t xml:space="preserve"> — Apple Reconditionné : 4 iMac M4 listés et prix lus dans le HTML.</w:t>
+        <w:t xml:space="preserve"> — Apple Reconditionné : 13 iMac M4 listés (1 519 € à 2 719 €) et prix lus dans le HTML — compte relu le 20/09/2026.</w:t>
       </w:r>
     </w:p>
     <w:p>
@@ -4475,7 +4629,7 @@
           <w:sz w:val="22"/>
           <w:szCs w:val="22"/>
         </w:rPr>
-        <w:t xml:space="preserve"> — tous les deals listés sont expirés (dernier en date : 08/07/2026).</w:t>
+        <w:t xml:space="preserve"> — tous les deals listés sont expirés (dernier en date : 29/08/2026, Fnac « BTS26 », expiré) [Corrigé le 20/09/2026 : la note écrivait 08/07/2026].</w:t>
       </w:r>
     </w:p>
     <w:p>
@@ -4607,7 +4761,7 @@
           <w:sz w:val="22"/>
           <w:szCs w:val="22"/>
         </w:rPr>
-        <w:t xml:space="preserve">Nouveau HP OmniStudio X 27-cs1011nf (27" 4K UHD, Core Ultra 7, 32 Go, 1 To) : page Fnac inaccessible (403) cette semaine — retenter sur LDLC ou Boulanger.</w:t>
+        <w:t xml:space="preserve">Nouveau HP OmniStudio X 27-cs1011nf (27" 4K UHD, Core Ultra 7, 32 Go, 1 To) : page Fnac inaccessible (403) cette semaine, adresse non conservée — tentative hors décompte des sources ; retenter sur LDLC ou Boulanger.</w:t>
       </w:r>
     </w:p>
     <w:p>
@@ -4654,6 +4808,257 @@
           <w:szCs w:val="22"/>
         </w:rPr>
         <w:t xml:space="preserve">Périmètre stable : les 3 configurations suivies sont toujours référencées par les revendeurs (consomac.fr, 20/09/2026). Aucun changement à opérer.</w:t>
+      </w:r>
+    </w:p>
+    <w:p>
+      <w:pPr>
+        <w:pStyle w:val="Heading2"/>
+        <w:spacing w:after="100" w:before="280"/>
+      </w:pPr>
+      <w:r>
+        <w:rPr>
+          <w:rFonts w:ascii="Calibri" w:cs="Calibri" w:eastAsia="Calibri" w:hAnsi="Calibri"/>
+          <w:b/>
+          <w:bCs/>
+          <w:color w:val="1B3A6B"/>
+          <w:sz w:val="28"/>
+          <w:szCs w:val="28"/>
+        </w:rPr>
+        <w:t xml:space="preserve">📝 Journal des corrections (20/09/2026)</w:t>
+      </w:r>
+    </w:p>
+    <w:p>
+      <w:pPr>
+        <w:spacing w:after="40" w:before="40"/>
+      </w:pPr>
+      <w:r>
+        <w:rPr>
+          <w:rFonts w:ascii="Calibri" w:cs="Calibri" w:eastAsia="Calibri" w:hAnsi="Calibri"/>
+          <w:b w:val="false"/>
+          <w:bCs w:val="false"/>
+          <w:i w:val="false"/>
+          <w:iCs w:val="false"/>
+          <w:color w:val="1F2937"/>
+          <w:sz w:val="22"/>
+          <w:szCs w:val="22"/>
+        </w:rPr>
+        <w:t xml:space="preserve">Relecture du 20/09/2026, chaque page rouverte avec un agent de navigateur. Les corrections sont intégrées ci-dessus avec un marqueur daté ; ce journal garde la formulation d'origine. Rien n'a changé aux prix du neuf ni aux fiches LDLC.</w:t>
+      </w:r>
+    </w:p>
+    <w:p>
+      <w:pPr>
+        <w:spacing w:after="40" w:before="40"/>
+      </w:pPr>
+      <w:r>
+        <w:rPr>
+          <w:rFonts w:ascii="Calibri" w:cs="Calibri" w:eastAsia="Calibri" w:hAnsi="Calibri"/>
+          <w:b w:val="false"/>
+          <w:bCs w:val="false"/>
+          <w:i w:val="false"/>
+          <w:iCs w:val="false"/>
+          <w:color w:val="1F2937"/>
+          <w:sz w:val="22"/>
+          <w:szCs w:val="22"/>
+        </w:rPr>
+        <w:t xml:space="preserve">• En bref : « 1 049 € en France — +50 % vs Mac mini M4 à 699 €. … puce 2 nm TSMC » — le M4 est à 949 € depuis juin (consomac, macg) ; le « 2 nm » n'est sur aucune des pages listées.</w:t>
+      </w:r>
+    </w:p>
+    <w:p>
+      <w:pPr>
+        <w:spacing w:after="40" w:before="40"/>
+      </w:pPr>
+      <w:r>
+        <w:rPr>
+          <w:rFonts w:ascii="Calibri" w:cs="Calibri" w:eastAsia="Calibri" w:hAnsi="Calibri"/>
+          <w:b w:val="false"/>
+          <w:bCs w:val="false"/>
+          <w:i w:val="false"/>
+          <w:iCs w:val="false"/>
+          <w:color w:val="1F2937"/>
+          <w:sz w:val="22"/>
+          <w:szCs w:val="22"/>
+        </w:rPr>
+        <w:t xml:space="preserve">• En bref : « Apple Reconditionné : 4 iMac M4 disponibles dont 2 à 1 689 € (10c/10c, 16 Go, 256 Go) » — treize sur la page, dont deux 8c/8c à 1 519 €.</w:t>
+      </w:r>
+    </w:p>
+    <w:p>
+      <w:pPr>
+        <w:spacing w:after="40" w:before="40"/>
+      </w:pPr>
+      <w:r>
+        <w:rPr>
+          <w:rFonts w:ascii="Calibri" w:cs="Calibri" w:eastAsia="Calibri" w:hAnsi="Calibri"/>
+          <w:b w:val="false"/>
+          <w:bCs w:val="false"/>
+          <w:i w:val="false"/>
+          <w:iCs w:val="false"/>
+          <w:color w:val="1F2937"/>
+          <w:sz w:val="22"/>
+          <w:szCs w:val="22"/>
+        </w:rPr>
+        <w:t xml:space="preserve">• En bref : « Gurman (Bloomberg) dit "avant fin 2026" et "tout indique un lancement imminent" » — la seconde est une phrase de 9to5Mac, que seul MacRumors prête à Gurman.</w:t>
+      </w:r>
+    </w:p>
+    <w:p>
+      <w:pPr>
+        <w:spacing w:after="40" w:before="40"/>
+      </w:pPr>
+      <w:r>
+        <w:rPr>
+          <w:rFonts w:ascii="Calibri" w:cs="Calibri" w:eastAsia="Calibri" w:hAnsi="Calibri"/>
+          <w:b w:val="false"/>
+          <w:bCs w:val="false"/>
+          <w:i w:val="false"/>
+          <w:iCs w:val="false"/>
+          <w:color w:val="1F2937"/>
+          <w:sz w:val="22"/>
+          <w:szCs w:val="22"/>
+        </w:rPr>
+        <w:t xml:space="preserve">• Tableau reconditionné : 4 lignes (1 689 € Vert, 1 689 € Bleu, 1 879 € Argent, 2 719 € Rose « 32 Go · 1 To ») et « aucun gain financier sur cette config » — la page porte treize lignes de 1 519 € à 2 719 € ; « 32 Go · 1 To » n'est pas dans son texte.</w:t>
+      </w:r>
+    </w:p>
+    <w:p>
+      <w:pPr>
+        <w:spacing w:after="40" w:before="40"/>
+      </w:pPr>
+      <w:r>
+        <w:rPr>
+          <w:rFonts w:ascii="Calibri" w:cs="Calibri" w:eastAsia="Calibri" w:hAnsi="Calibri"/>
+          <w:b w:val="false"/>
+          <w:bCs w:val="false"/>
+          <w:i w:val="false"/>
+          <w:iCs w:val="false"/>
+          <w:color w:val="1F2937"/>
+          <w:sz w:val="22"/>
+          <w:szCs w:val="22"/>
+        </w:rPr>
+        <w:t xml:space="preserve">• Comparatif : « 8+ ans de support logiciel typique » — sans source.</w:t>
+      </w:r>
+    </w:p>
+    <w:p>
+      <w:pPr>
+        <w:spacing w:after="40" w:before="40"/>
+      </w:pPr>
+      <w:r>
+        <w:rPr>
+          <w:rFonts w:ascii="Calibri" w:cs="Calibri" w:eastAsia="Calibri" w:hAnsi="Calibri"/>
+          <w:b w:val="false"/>
+          <w:bCs w:val="false"/>
+          <w:i w:val="false"/>
+          <w:iCs w:val="false"/>
+          <w:color w:val="1F2937"/>
+          <w:sz w:val="22"/>
+          <w:szCs w:val="22"/>
+        </w:rPr>
+        <w:t xml:space="preserve">• Comparatif : « RAM DDR5 extensible jusqu'à 64 Go » — la fiche LDLC dit « SO-DIMM DDR5 (1x 32 Go - 2 slots) », le 64 est une déduction.</w:t>
+      </w:r>
+    </w:p>
+    <w:p>
+      <w:pPr>
+        <w:spacing w:after="40" w:before="40"/>
+      </w:pPr>
+      <w:r>
+        <w:rPr>
+          <w:rFonts w:ascii="Calibri" w:cs="Calibri" w:eastAsia="Calibri" w:hAnsi="Calibri"/>
+          <w:b w:val="false"/>
+          <w:bCs w:val="false"/>
+          <w:i w:val="false"/>
+          <w:iCs w:val="false"/>
+          <w:color w:val="1F2937"/>
+          <w:sz w:val="22"/>
+          <w:szCs w:val="22"/>
+        </w:rPr>
+        <w:t xml:space="preserve">• Bons plans : « iMac M4 10c/10c · 16 Go · 256 Go : 1 689 € (Vert ou Bleu) — même prix que le meilleur marché neuf » — le meilleur neuf à 1 689 € est un 8c/8c.</w:t>
+      </w:r>
+    </w:p>
+    <w:p>
+      <w:pPr>
+        <w:spacing w:after="40" w:before="40"/>
+      </w:pPr>
+      <w:r>
+        <w:rPr>
+          <w:rFonts w:ascii="Calibri" w:cs="Calibri" w:eastAsia="Calibri" w:hAnsi="Calibri"/>
+          <w:b w:val="false"/>
+          <w:bCs w:val="false"/>
+          <w:i w:val="false"/>
+          <w:iCs w:val="false"/>
+          <w:color w:val="1F2937"/>
+          <w:sz w:val="22"/>
+          <w:szCs w:val="22"/>
+        </w:rPr>
+        <w:t xml:space="preserve">• Calendrier : « Gurman (Bloomberg), cité par 9to5Mac (23/08/2026) : "before the end of the year" et "All signs point to the M6 models being close to launch" » — la seconde est nue chez 9to5Mac, entre guillemets chez MacRumors.</w:t>
+      </w:r>
+    </w:p>
+    <w:p>
+      <w:pPr>
+        <w:spacing w:after="40" w:before="40"/>
+      </w:pPr>
+      <w:r>
+        <w:rPr>
+          <w:rFonts w:ascii="Calibri" w:cs="Calibri" w:eastAsia="Calibri" w:hAnsi="Calibri"/>
+          <w:b w:val="false"/>
+          <w:bCs w:val="false"/>
+          <w:i w:val="false"/>
+          <w:iCs w:val="false"/>
+          <w:color w:val="1F2937"/>
+          <w:sz w:val="22"/>
+          <w:szCs w:val="22"/>
+        </w:rPr>
+        <w:t xml:space="preserve">• Specs M6 : « Procédé : 2 nm TSMC (première puce Apple Silicon à ce procédé — le M4 iMac actuel est en 3 nm) » — sur aucune page listée.</w:t>
+      </w:r>
+    </w:p>
+    <w:p>
+      <w:pPr>
+        <w:spacing w:after="40" w:before="40"/>
+      </w:pPr>
+      <w:r>
+        <w:rPr>
+          <w:rFonts w:ascii="Calibri" w:cs="Calibri" w:eastAsia="Calibri" w:hAnsi="Calibri"/>
+          <w:b w:val="false"/>
+          <w:bCs w:val="false"/>
+          <w:i w:val="false"/>
+          <w:iCs w:val="false"/>
+          <w:color w:val="1F2937"/>
+          <w:sz w:val="22"/>
+          <w:szCs w:val="22"/>
+        </w:rPr>
+        <w:t xml:space="preserve">• Signal M6 / Impact attendu : « +350 € soit +50 % » et « si le précédent Mac mini sert d'indicateur (+50 %) … significativement plus haut » — le M4 est à 949 € depuis juin (+100 € pour le M6), et l'iMac M4 a déjà pris sa hausse de juin.</w:t>
+      </w:r>
+    </w:p>
+    <w:p>
+      <w:pPr>
+        <w:spacing w:after="40" w:before="40"/>
+      </w:pPr>
+      <w:r>
+        <w:rPr>
+          <w:rFonts w:ascii="Calibri" w:cs="Calibri" w:eastAsia="Calibri" w:hAnsi="Calibri"/>
+          <w:b w:val="false"/>
+          <w:bCs w:val="false"/>
+          <w:i w:val="false"/>
+          <w:iCs w:val="false"/>
+          <w:color w:val="1F2937"/>
+          <w:sz w:val="22"/>
+          <w:szCs w:val="22"/>
+        </w:rPr>
+        <w:t xml:space="preserve">• Scénarios : « Puce M6 2 nm … (CPU +40 %+ vs M4) », « Puce la plus récente (2 nm, …) », « le Mac mini M6 a pris +50 % vs M4 — risque réel … plusieurs centaines d'euros ».</w:t>
+      </w:r>
+    </w:p>
+    <w:p>
+      <w:pPr>
+        <w:spacing w:after="40" w:before="40"/>
+      </w:pPr>
+      <w:r>
+        <w:rPr>
+          <w:rFonts w:ascii="Calibri" w:cs="Calibri" w:eastAsia="Calibri" w:hAnsi="Calibri"/>
+          <w:b w:val="false"/>
+          <w:bCs w:val="false"/>
+          <w:i w:val="false"/>
+          <w:iCs w:val="false"/>
+          <w:color w:val="1F2937"/>
+          <w:sz w:val="22"/>
+          <w:szCs w:val="22"/>
+        </w:rPr>
+        <w:t xml:space="preserve">• Sources : « tous les deals listés sont expirés (dernier en date : 08/07/2026) » — le dernier est du 29/08/2026.</w:t>
       </w:r>
     </w:p>
     <w:sectPr>

</xml_diff>